<commit_message>
Revert "Betriebsanleitung mit aktuellem Git-/Image-Stand aktualisieren, Skript-Fixes und AP27-Testnachweise ergänzen"
This reverts commit 7fe1e69a3d6833a70d13f27009fcad7aa54ec68f.
</commit_message>
<xml_diff>
--- a/dokumentation/10_uebergabe_und_betriebsanleitung.docx
+++ b/dokumentation/10_uebergabe_und_betriebsanleitung.docx
@@ -1005,7 +1005,7 @@
               <w:rPr>
                 <w:sz w:val="14"/>
               </w:rPr>
-              <w:t>Erfasst: 076b02a16960878fb1f1365ad677016fb2399bee</w:t>
+              <w:t>Noch unmittelbar vor Übergabe erfassen</w:t>
             </w:r>
           </w:p>
         </w:tc>
@@ -1049,7 +1049,7 @@
               <w:rPr>
                 <w:sz w:val="14"/>
               </w:rPr>
-              <w:t>Erfasst: 6620bf09b3904d6920229256ac94dbff03769621</w:t>
+              <w:t>Noch unmittelbar vor Übergabe erfassen</w:t>
             </w:r>
           </w:p>
         </w:tc>
@@ -1093,7 +1093,7 @@
               <w:rPr>
                 <w:sz w:val="14"/>
               </w:rPr>
-              <w:t>Tag 076b02a… ist belegt; Digest erfasst: sha256:f3da04a53e86376e0adb533c9e6d523b34c958ae23fd423da570e8b32da36b38</w:t>
+              <w:t>Tag a4c49… ist belegt; Digest hier nicht final belegt</w:t>
             </w:r>
           </w:p>
         </w:tc>
@@ -1137,7 +1137,7 @@
               <w:rPr>
                 <w:sz w:val="14"/>
               </w:rPr>
-              <w:t>Digest erfasst: sha256:8a30554bf682a9a326f1227ec0e3978eab03b982bbe41e0d13ab1aad21d379f6 (SHA 2ae1f2e… unverändert seit Rollback T29)</w:t>
+              <w:t>Nach Rollback ist SHA 2ae1f2e… dokumentiert; Digest separat erfassen</w:t>
             </w:r>
           </w:p>
         </w:tc>
@@ -5477,7 +5477,7 @@
               <w:rPr>
                 <w:sz w:val="14"/>
               </w:rPr>
-              <w:t>Erfasst und mit den finalen Git-Ständen abgeglichen: pacman-app 076b02a16960878fb1f1365ad677016fb2399bee; pacman-gitops 6620bf09b3904d6920229256ac94dbff03769621.</w:t>
+              <w:t>Erfasst und mit den finalen Git-Ständen abgeglichen: pacman-app a4c49abd81d9f5c4472b90110cb3fca5ae0348c2; pacman-gitops 692b49bb3510a481406717c2fe4faa793f3c8e0f.</w:t>
             </w:r>
           </w:p>
         </w:tc>
@@ -5507,7 +5507,7 @@
               <w:rPr>
                 <w:sz w:val="14"/>
               </w:rPr>
-              <w:t>Erfasst und mit den tatsächlich laufenden Pods abgeglichen. Dev: sha256:f3da04a53e86376e0adb533c9e6d523b34c958ae23fd423da570e8b32da36b38; Prod: sha256:8a30554bf682a9a326f1227ec0e3978eab03b982bbe41e0d13ab1aad21d379f6.</w:t>
+              <w:t>Erfasst und mit den tatsächlich laufenden Pods abgeglichen. Dev: sha256:114b3c9505cf4dde0e58101127f4e2ae6395928e7f013e33e7c8039cc2496490; Prod: sha256:8a30554bf682a9a326f1227ec0e3978eab03b982bbe41e0d13ab1aad21d379f6.</w:t>
             </w:r>
           </w:p>
         </w:tc>
@@ -5642,7 +5642,7 @@
         <w:t xml:space="preserve">pacman-app Commit: </w:t>
       </w:r>
       <w:r>
-        <w:t xml:space="preserve">076b02a16960878fb1f1365ad677016fb2399bee</w:t>
+        <w:t xml:space="preserve">a4c49abd81d9f5c4472b90110cb3fca5ae0348c2</w:t>
       </w:r>
     </w:p>
     <w:p>
@@ -5653,7 +5653,7 @@
         <w:t xml:space="preserve">pacman-gitops Commit: </w:t>
       </w:r>
       <w:r>
-        <w:t xml:space="preserve">6620bf09b3904d6920229256ac94dbff03769621</w:t>
+        <w:t xml:space="preserve">692b49bb3510a481406717c2fe4faa793f3c8e0f</w:t>
       </w:r>
     </w:p>
     <w:p>
@@ -5746,7 +5746,7 @@
         <w:t xml:space="preserve">Image: </w:t>
       </w:r>
       <w:r>
-        <w:t xml:space="preserve">ghcr.io/isangare-ux/pacman-app:076b02a16960878fb1f1365ad677016fb2399bee</w:t>
+        <w:t xml:space="preserve">ghcr.io/isangare-ux/pacman-app:a4c49abd81d9f5c4472b90110cb3fca5ae0348c2</w:t>
       </w:r>
     </w:p>
     <w:p>
@@ -5757,7 +5757,7 @@
         <w:t xml:space="preserve">Image Digest: </w:t>
       </w:r>
       <w:r>
-        <w:t xml:space="preserve">sha256:f3da04a53e86376e0adb533c9e6d523b34c958ae23fd423da570e8b32da36b38</w:t>
+        <w:t xml:space="preserve">sha256:114b3c9505cf4dde0e58101127f4e2ae6395928e7f013e33e7c8039cc2496490</w:t>
       </w:r>
     </w:p>
     <w:p>

</xml_diff>